<commit_message>
docs: agregar capturas de evidencia al Word de SC-LAB-006
Capturas de pytest antes/despues, acceso denegado, casos manuales,
pip-audit y del pipeline; se versiona el script de casos manuales.

Co-Authored-By: Claude Opus 5.5 <noreply@anthropic.com>
Claude-Session: https://claude.ai/code/session_01UN1VRPEzKjTYC5W9Bw5sdq
</commit_message>
<xml_diff>
--- a/docs/SC_LAB_006_Guia_Estudiante_Laboratorio_Integrador.docx
+++ b/docs/SC_LAB_006_Guia_Estudiante_Laboratorio_Integrador.docx
@@ -1729,6 +1729,98 @@
         <w:t>los 8 de test_grade_invalid (150, -1, hola, cadena vacía, NaN, Infinity, None y 99.999). Antes, 150, -1, NaN, Infinity y 99.999 se guardaban con 200; hola, "" y None provocaban una excepción decimal.InvalidOperation no controlada (500 en producción).</w:t>
       </w:r>
     </w:p>
+    <w:p>
+      <w:r>
+        <w:drawing>
+          <wp:inline xmlns:a="http://schemas.openxmlformats.org/drawingml/2006/main" xmlns:pic="http://schemas.openxmlformats.org/drawingml/2006/picture">
+            <wp:extent cx="5760000" cy="1564981"/>
+            <wp:docPr id="2" name="Picture 2"/>
+            <wp:cNvGraphicFramePr>
+              <a:graphicFrameLocks noChangeAspect="1"/>
+            </wp:cNvGraphicFramePr>
+            <a:graphic>
+              <a:graphicData uri="http://schemas.openxmlformats.org/drawingml/2006/picture">
+                <pic:pic>
+                  <pic:nvPicPr>
+                    <pic:cNvPr id="0" name="02_grade_invalid_antes.png"/>
+                    <pic:cNvPicPr/>
+                  </pic:nvPicPr>
+                  <pic:blipFill>
+                    <a:blip r:embed="rId16"/>
+                    <a:stretch>
+                      <a:fillRect/>
+                    </a:stretch>
+                  </pic:blipFill>
+                  <pic:spPr>
+                    <a:xfrm>
+                      <a:off x="0" y="0"/>
+                      <a:ext cx="5760000" cy="1564981"/>
+                    </a:xfrm>
+                    <a:prstGeom prst="rect"/>
+                  </pic:spPr>
+                </pic:pic>
+              </a:graphicData>
+            </a:graphic>
+          </wp:inline>
+        </w:drawing>
+      </w:r>
+    </w:p>
+    <w:p>
+      <w:r>
+        <w:rPr>
+          <w:i/>
+          <w:color w:val="16304E"/>
+          <w:sz w:val="16"/>
+        </w:rPr>
+        <w:t>Captura 1. test_grade_invalid con el código inicial: 8 fallas.</w:t>
+      </w:r>
+    </w:p>
+    <w:p>
+      <w:r>
+        <w:drawing>
+          <wp:inline xmlns:a="http://schemas.openxmlformats.org/drawingml/2006/main" xmlns:pic="http://schemas.openxmlformats.org/drawingml/2006/picture">
+            <wp:extent cx="5760000" cy="2059472"/>
+            <wp:docPr id="3" name="Picture 3"/>
+            <wp:cNvGraphicFramePr>
+              <a:graphicFrameLocks noChangeAspect="1"/>
+            </wp:cNvGraphicFramePr>
+            <a:graphic>
+              <a:graphicData uri="http://schemas.openxmlformats.org/drawingml/2006/picture">
+                <pic:pic>
+                  <pic:nvPicPr>
+                    <pic:cNvPr id="0" name="02b_grade_invalid_despues.png"/>
+                    <pic:cNvPicPr/>
+                  </pic:nvPicPr>
+                  <pic:blipFill>
+                    <a:blip r:embed="rId17"/>
+                    <a:stretch>
+                      <a:fillRect/>
+                    </a:stretch>
+                  </pic:blipFill>
+                  <pic:spPr>
+                    <a:xfrm>
+                      <a:off x="0" y="0"/>
+                      <a:ext cx="5760000" cy="2059472"/>
+                    </a:xfrm>
+                    <a:prstGeom prst="rect"/>
+                  </pic:spPr>
+                </pic:pic>
+              </a:graphicData>
+            </a:graphic>
+          </wp:inline>
+        </w:drawing>
+      </w:r>
+    </w:p>
+    <w:p>
+      <w:r>
+        <w:rPr>
+          <w:i/>
+          <w:color w:val="16304E"/>
+          <w:sz w:val="16"/>
+        </w:rPr>
+        <w:t>Captura 2. test_grade_invalid con validators.py completo: 8 aprobadas.</w:t>
+      </w:r>
+    </w:p>
     <w:tbl>
       <w:tblPr>
         <w:tblStyle w:val="Sombreadoclaro-nfasis1"/>
@@ -3145,138 +3237,54 @@
       </w:r>
     </w:p>
     <w:p>
-      <w:pPr>
-        <w:shd w:val="clear" w:color="auto" w:fill="F2F5F9"/>
-      </w:pPr>
       <w:r>
-        <w:rPr>
-          <w:rFonts w:ascii="Consolas" w:hAnsi="Consolas"/>
-          <w:color w:val="16304E"/>
-          <w:sz w:val="16"/>
-        </w:rPr>
-        <w:t>$ python -m pytest -q</w:t>
-        <w:br/>
-      </w:r>
-      <w:r>
-        <w:rPr>
-          <w:rFonts w:ascii="Consolas" w:hAnsi="Consolas"/>
-          <w:color w:val="16304E"/>
-          <w:sz w:val="16"/>
-        </w:rPr>
-        <w:t>FFFFFFFF.FFF...                                                          [100%]</w:t>
-        <w:br/>
-      </w:r>
-      <w:r>
-        <w:rPr>
-          <w:rFonts w:ascii="Consolas" w:hAnsi="Consolas"/>
-          <w:color w:val="16304E"/>
-          <w:sz w:val="16"/>
-        </w:rPr>
-        <w:t>FAILED tests/test_security.py::test_grade_invalid[150] - AssertionError: asse...</w:t>
-        <w:br/>
-      </w:r>
-      <w:r>
-        <w:rPr>
-          <w:rFonts w:ascii="Consolas" w:hAnsi="Consolas"/>
-          <w:color w:val="16304E"/>
-          <w:sz w:val="16"/>
-        </w:rPr>
-        <w:t>FAILED tests/test_security.py::test_grade_invalid[-1] - AssertionError: asser...</w:t>
-        <w:br/>
-      </w:r>
-      <w:r>
-        <w:rPr>
-          <w:rFonts w:ascii="Consolas" w:hAnsi="Consolas"/>
-          <w:color w:val="16304E"/>
-          <w:sz w:val="16"/>
-        </w:rPr>
-        <w:t>FAILED tests/test_security.py::test_grade_invalid[hola] - decimal.InvalidOper...</w:t>
-        <w:br/>
-      </w:r>
-      <w:r>
-        <w:rPr>
-          <w:rFonts w:ascii="Consolas" w:hAnsi="Consolas"/>
-          <w:color w:val="16304E"/>
-          <w:sz w:val="16"/>
-        </w:rPr>
-        <w:t>FAILED tests/test_security.py::test_grade_invalid[] - decimal.InvalidOperatio...</w:t>
-        <w:br/>
-      </w:r>
-      <w:r>
-        <w:rPr>
-          <w:rFonts w:ascii="Consolas" w:hAnsi="Consolas"/>
-          <w:color w:val="16304E"/>
-          <w:sz w:val="16"/>
-        </w:rPr>
-        <w:t>FAILED tests/test_security.py::test_grade_invalid[NaN] - AssertionError: asse...</w:t>
-        <w:br/>
-      </w:r>
-      <w:r>
-        <w:rPr>
-          <w:rFonts w:ascii="Consolas" w:hAnsi="Consolas"/>
-          <w:color w:val="16304E"/>
-          <w:sz w:val="16"/>
-        </w:rPr>
-        <w:t>FAILED tests/test_security.py::test_grade_invalid[Infinity] - AssertionError:...</w:t>
-        <w:br/>
-      </w:r>
-      <w:r>
-        <w:rPr>
-          <w:rFonts w:ascii="Consolas" w:hAnsi="Consolas"/>
-          <w:color w:val="16304E"/>
-          <w:sz w:val="16"/>
-        </w:rPr>
-        <w:t>FAILED tests/test_security.py::test_grade_invalid[None] - decimal.InvalidOper...</w:t>
-        <w:br/>
-      </w:r>
-      <w:r>
-        <w:rPr>
-          <w:rFonts w:ascii="Consolas" w:hAnsi="Consolas"/>
-          <w:color w:val="16304E"/>
-          <w:sz w:val="16"/>
-        </w:rPr>
-        <w:t>FAILED tests/test_security.py::test_grade_invalid[99.999] - AssertionError: a...</w:t>
-        <w:br/>
-      </w:r>
-      <w:r>
-        <w:rPr>
-          <w:rFonts w:ascii="Consolas" w:hAnsi="Consolas"/>
-          <w:color w:val="16304E"/>
-          <w:sz w:val="16"/>
-        </w:rPr>
-        <w:t>FAILED tests/test_security.py::test_professor_other_group_forbidden - Asserti...</w:t>
-        <w:br/>
-      </w:r>
-      <w:r>
-        <w:rPr>
-          <w:rFonts w:ascii="Consolas" w:hAnsi="Consolas"/>
-          <w:color w:val="16304E"/>
-          <w:sz w:val="16"/>
-        </w:rPr>
-        <w:t>FAILED tests/test_security.py::test_student_cannot_modify - AssertionError: a...</w:t>
-        <w:br/>
-      </w:r>
-      <w:r>
-        <w:rPr>
-          <w:rFonts w:ascii="Consolas" w:hAnsi="Consolas"/>
-          <w:color w:val="16304E"/>
-          <w:sz w:val="16"/>
-        </w:rPr>
-        <w:t>FAILED tests/test_security.py::test_student_cannot_read_other_student - Asser...</w:t>
-        <w:br/>
-      </w:r>
-      <w:r>
-        <w:rPr>
-          <w:rFonts w:ascii="Consolas" w:hAnsi="Consolas"/>
-          <w:color w:val="16304E"/>
-          <w:sz w:val="16"/>
-        </w:rPr>
-        <w:t>11 failed, 4 passed in 11.81s</w:t>
+        <w:drawing>
+          <wp:inline xmlns:a="http://schemas.openxmlformats.org/drawingml/2006/main" xmlns:pic="http://schemas.openxmlformats.org/drawingml/2006/picture">
+            <wp:extent cx="5760000" cy="1794462"/>
+            <wp:docPr id="4" name="Picture 4"/>
+            <wp:cNvGraphicFramePr>
+              <a:graphicFrameLocks noChangeAspect="1"/>
+            </wp:cNvGraphicFramePr>
+            <a:graphic>
+              <a:graphicData uri="http://schemas.openxmlformats.org/drawingml/2006/picture">
+                <pic:pic>
+                  <pic:nvPicPr>
+                    <pic:cNvPr id="0" name="01_pytest_antes.png"/>
+                    <pic:cNvPicPr/>
+                  </pic:nvPicPr>
+                  <pic:blipFill>
+                    <a:blip r:embed="rId18"/>
+                    <a:stretch>
+                      <a:fillRect/>
+                    </a:stretch>
+                  </pic:blipFill>
+                  <pic:spPr>
+                    <a:xfrm>
+                      <a:off x="0" y="0"/>
+                      <a:ext cx="5760000" cy="1794462"/>
+                    </a:xfrm>
+                    <a:prstGeom prst="rect"/>
+                  </pic:spPr>
+                </pic:pic>
+              </a:graphicData>
+            </a:graphic>
+          </wp:inline>
+        </w:drawing>
       </w:r>
     </w:p>
     <w:p>
       <w:r>
         <w:rPr>
+          <w:i/>
+          <w:color w:val="16304E"/>
+          <w:sz w:val="16"/>
+        </w:rPr>
+        <w:t>Captura 3. pytest con el código inicial.</w:t>
+      </w:r>
+    </w:p>
+    <w:p>
+      <w:r>
+        <w:rPr>
           <w:b/>
         </w:rPr>
         <w:t xml:space="preserve">Después (validators.py y permissions.py completos): </w:t>
@@ -3289,160 +3297,49 @@
       </w:r>
     </w:p>
     <w:p>
-      <w:pPr>
-        <w:shd w:val="clear" w:color="auto" w:fill="F2F5F9"/>
-      </w:pPr>
       <w:r>
-        <w:rPr>
-          <w:rFonts w:ascii="Consolas" w:hAnsi="Consolas"/>
+        <w:drawing>
+          <wp:inline xmlns:a="http://schemas.openxmlformats.org/drawingml/2006/main" xmlns:pic="http://schemas.openxmlformats.org/drawingml/2006/picture">
+            <wp:extent cx="5760000" cy="2697231"/>
+            <wp:docPr id="5" name="Picture 5"/>
+            <wp:cNvGraphicFramePr>
+              <a:graphicFrameLocks noChangeAspect="1"/>
+            </wp:cNvGraphicFramePr>
+            <a:graphic>
+              <a:graphicData uri="http://schemas.openxmlformats.org/drawingml/2006/picture">
+                <pic:pic>
+                  <pic:nvPicPr>
+                    <pic:cNvPr id="0" name="03_pytest_despues.png"/>
+                    <pic:cNvPicPr/>
+                  </pic:nvPicPr>
+                  <pic:blipFill>
+                    <a:blip r:embed="rId19"/>
+                    <a:stretch>
+                      <a:fillRect/>
+                    </a:stretch>
+                  </pic:blipFill>
+                  <pic:spPr>
+                    <a:xfrm>
+                      <a:off x="0" y="0"/>
+                      <a:ext cx="5760000" cy="2697231"/>
+                    </a:xfrm>
+                    <a:prstGeom prst="rect"/>
+                  </pic:spPr>
+                </pic:pic>
+              </a:graphicData>
+            </a:graphic>
+          </wp:inline>
+        </w:drawing>
+      </w:r>
+    </w:p>
+    <w:p>
+      <w:r>
+        <w:rPr>
+          <w:i/>
           <w:color w:val="16304E"/>
           <w:sz w:val="16"/>
         </w:rPr>
-        <w:t>$ python -m pytest -v</w:t>
-        <w:br/>
-      </w:r>
-      <w:r>
-        <w:rPr>
-          <w:rFonts w:ascii="Consolas" w:hAnsi="Consolas"/>
-          <w:color w:val="16304E"/>
-          <w:sz w:val="16"/>
-        </w:rPr>
-        <w:t>tests/test_security.py::test_grade_invalid[150] PASSED                   [  6%]</w:t>
-        <w:br/>
-      </w:r>
-      <w:r>
-        <w:rPr>
-          <w:rFonts w:ascii="Consolas" w:hAnsi="Consolas"/>
-          <w:color w:val="16304E"/>
-          <w:sz w:val="16"/>
-        </w:rPr>
-        <w:t>tests/test_security.py::test_grade_invalid[-1] PASSED                    [ 13%]</w:t>
-        <w:br/>
-      </w:r>
-      <w:r>
-        <w:rPr>
-          <w:rFonts w:ascii="Consolas" w:hAnsi="Consolas"/>
-          <w:color w:val="16304E"/>
-          <w:sz w:val="16"/>
-        </w:rPr>
-        <w:t>tests/test_security.py::test_grade_invalid[hola] PASSED                  [ 20%]</w:t>
-        <w:br/>
-      </w:r>
-      <w:r>
-        <w:rPr>
-          <w:rFonts w:ascii="Consolas" w:hAnsi="Consolas"/>
-          <w:color w:val="16304E"/>
-          <w:sz w:val="16"/>
-        </w:rPr>
-        <w:t>tests/test_security.py::test_grade_invalid[] PASSED                      [ 26%]</w:t>
-        <w:br/>
-      </w:r>
-      <w:r>
-        <w:rPr>
-          <w:rFonts w:ascii="Consolas" w:hAnsi="Consolas"/>
-          <w:color w:val="16304E"/>
-          <w:sz w:val="16"/>
-        </w:rPr>
-        <w:t>tests/test_security.py::test_grade_invalid[NaN] PASSED                   [ 33%]</w:t>
-        <w:br/>
-      </w:r>
-      <w:r>
-        <w:rPr>
-          <w:rFonts w:ascii="Consolas" w:hAnsi="Consolas"/>
-          <w:color w:val="16304E"/>
-          <w:sz w:val="16"/>
-        </w:rPr>
-        <w:t>tests/test_security.py::test_grade_invalid[Infinity] PASSED              [ 40%]</w:t>
-        <w:br/>
-      </w:r>
-      <w:r>
-        <w:rPr>
-          <w:rFonts w:ascii="Consolas" w:hAnsi="Consolas"/>
-          <w:color w:val="16304E"/>
-          <w:sz w:val="16"/>
-        </w:rPr>
-        <w:t>tests/test_security.py::test_grade_invalid[None] PASSED                  [ 46%]</w:t>
-        <w:br/>
-      </w:r>
-      <w:r>
-        <w:rPr>
-          <w:rFonts w:ascii="Consolas" w:hAnsi="Consolas"/>
-          <w:color w:val="16304E"/>
-          <w:sz w:val="16"/>
-        </w:rPr>
-        <w:t>tests/test_security.py::test_grade_invalid[99.999] PASSED                [ 53%]</w:t>
-        <w:br/>
-      </w:r>
-      <w:r>
-        <w:rPr>
-          <w:rFonts w:ascii="Consolas" w:hAnsi="Consolas"/>
-          <w:color w:val="16304E"/>
-          <w:sz w:val="16"/>
-        </w:rPr>
-        <w:t>tests/test_security.py::test_professor_own_group PASSED                  [ 60%]</w:t>
-        <w:br/>
-      </w:r>
-      <w:r>
-        <w:rPr>
-          <w:rFonts w:ascii="Consolas" w:hAnsi="Consolas"/>
-          <w:color w:val="16304E"/>
-          <w:sz w:val="16"/>
-        </w:rPr>
-        <w:t>tests/test_security.py::test_professor_other_group_forbidden PASSED      [ 66%]</w:t>
-        <w:br/>
-      </w:r>
-      <w:r>
-        <w:rPr>
-          <w:rFonts w:ascii="Consolas" w:hAnsi="Consolas"/>
-          <w:color w:val="16304E"/>
-          <w:sz w:val="16"/>
-        </w:rPr>
-        <w:t>tests/test_security.py::test_student_cannot_modify PASSED                [ 73%]</w:t>
-        <w:br/>
-      </w:r>
-      <w:r>
-        <w:rPr>
-          <w:rFonts w:ascii="Consolas" w:hAnsi="Consolas"/>
-          <w:color w:val="16304E"/>
-          <w:sz w:val="16"/>
-        </w:rPr>
-        <w:t>tests/test_security.py::test_student_cannot_read_other_student PASSED    [ 80%]</w:t>
-        <w:br/>
-      </w:r>
-      <w:r>
-        <w:rPr>
-          <w:rFonts w:ascii="Consolas" w:hAnsi="Consolas"/>
-          <w:color w:val="16304E"/>
-          <w:sz w:val="16"/>
-        </w:rPr>
-        <w:t>tests/test_security.py::test_csrf_required PASSED                        [ 86%]</w:t>
-        <w:br/>
-      </w:r>
-      <w:r>
-        <w:rPr>
-          <w:rFonts w:ascii="Consolas" w:hAnsi="Consolas"/>
-          <w:color w:val="16304E"/>
-          <w:sz w:val="16"/>
-        </w:rPr>
-        <w:t>tests/test_security.py::test_logout_revokes PASSED                       [ 93%]</w:t>
-        <w:br/>
-      </w:r>
-      <w:r>
-        <w:rPr>
-          <w:rFonts w:ascii="Consolas" w:hAnsi="Consolas"/>
-          <w:color w:val="16304E"/>
-          <w:sz w:val="16"/>
-        </w:rPr>
-        <w:t>tests/test_security.py::test_outbox_transaction PASSED                   [100%]</w:t>
-        <w:br/>
-      </w:r>
-      <w:r>
-        <w:rPr>
-          <w:rFonts w:ascii="Consolas" w:hAnsi="Consolas"/>
-          <w:color w:val="16304E"/>
-          <w:sz w:val="16"/>
-        </w:rPr>
-        <w:t>============================= 15 passed in 11.82s ==============================</w:t>
+        <w:t>Captura 4. pytest con los controles completos.</w:t>
       </w:r>
     </w:p>
     <w:p>
@@ -3467,106 +3364,95 @@
       </w:r>
     </w:p>
     <w:p>
-      <w:pPr>
-        <w:shd w:val="clear" w:color="auto" w:fill="F2F5F9"/>
-      </w:pPr>
       <w:r>
-        <w:rPr>
-          <w:rFonts w:ascii="Consolas" w:hAnsi="Consolas"/>
+        <w:drawing>
+          <wp:inline xmlns:a="http://schemas.openxmlformats.org/drawingml/2006/main" xmlns:pic="http://schemas.openxmlformats.org/drawingml/2006/picture">
+            <wp:extent cx="5760000" cy="1760604"/>
+            <wp:docPr id="6" name="Picture 6"/>
+            <wp:cNvGraphicFramePr>
+              <a:graphicFrameLocks noChangeAspect="1"/>
+            </wp:cNvGraphicFramePr>
+            <a:graphic>
+              <a:graphicData uri="http://schemas.openxmlformats.org/drawingml/2006/picture">
+                <pic:pic>
+                  <pic:nvPicPr>
+                    <pic:cNvPr id="0" name="04_acceso_denegado.png"/>
+                    <pic:cNvPicPr/>
+                  </pic:nvPicPr>
+                  <pic:blipFill>
+                    <a:blip r:embed="rId20"/>
+                    <a:stretch>
+                      <a:fillRect/>
+                    </a:stretch>
+                  </pic:blipFill>
+                  <pic:spPr>
+                    <a:xfrm>
+                      <a:off x="0" y="0"/>
+                      <a:ext cx="5760000" cy="1760604"/>
+                    </a:xfrm>
+                    <a:prstGeom prst="rect"/>
+                  </pic:spPr>
+                </pic:pic>
+              </a:graphicData>
+            </a:graphic>
+          </wp:inline>
+        </w:drawing>
+      </w:r>
+    </w:p>
+    <w:p>
+      <w:r>
+        <w:rPr>
+          <w:i/>
           <w:color w:val="16304E"/>
           <w:sz w:val="16"/>
         </w:rPr>
-        <w:t>Profesor propio / PUT        PUT /grades/3/10 -&gt; 200 {'grade': '90', 'message': 'Calificación guardada'}</w:t>
-        <w:br/>
+        <w:t>Captura 5. Pruebas automatizadas de acceso denegado, CSRF y logout.</w:t>
       </w:r>
+    </w:p>
+    <w:p>
       <w:r>
-        <w:rPr>
-          <w:rFonts w:ascii="Consolas" w:hAnsi="Consolas"/>
+        <w:drawing>
+          <wp:inline xmlns:a="http://schemas.openxmlformats.org/drawingml/2006/main" xmlns:pic="http://schemas.openxmlformats.org/drawingml/2006/picture">
+            <wp:extent cx="5760000" cy="2198769"/>
+            <wp:docPr id="7" name="Picture 7"/>
+            <wp:cNvGraphicFramePr>
+              <a:graphicFrameLocks noChangeAspect="1"/>
+            </wp:cNvGraphicFramePr>
+            <a:graphic>
+              <a:graphicData uri="http://schemas.openxmlformats.org/drawingml/2006/picture">
+                <pic:pic>
+                  <pic:nvPicPr>
+                    <pic:cNvPr id="0" name="05_casos_manuales.png"/>
+                    <pic:cNvPicPr/>
+                  </pic:nvPicPr>
+                  <pic:blipFill>
+                    <a:blip r:embed="rId21"/>
+                    <a:stretch>
+                      <a:fillRect/>
+                    </a:stretch>
+                  </pic:blipFill>
+                  <pic:spPr>
+                    <a:xfrm>
+                      <a:off x="0" y="0"/>
+                      <a:ext cx="5760000" cy="2198769"/>
+                    </a:xfrm>
+                    <a:prstGeom prst="rect"/>
+                  </pic:spPr>
+                </pic:pic>
+              </a:graphicData>
+            </a:graphic>
+          </wp:inline>
+        </w:drawing>
+      </w:r>
+    </w:p>
+    <w:p>
+      <w:r>
+        <w:rPr>
+          <w:i/>
           <w:color w:val="16304E"/>
           <w:sz w:val="16"/>
         </w:rPr>
-        <w:t>Profesor ajeno / PUT         PUT /grades/4/20 -&gt; 403 {'error': 'Acceso denegado'}</w:t>
-        <w:br/>
-      </w:r>
-      <w:r>
-        <w:rPr>
-          <w:rFonts w:ascii="Consolas" w:hAnsi="Consolas"/>
-          <w:color w:val="16304E"/>
-          <w:sz w:val="16"/>
-        </w:rPr>
-        <w:t>Profesor ajeno / GET         GET /grades/4/20 -&gt; 403 {'error': 'Acceso denegado'}</w:t>
-        <w:br/>
-      </w:r>
-      <w:r>
-        <w:rPr>
-          <w:rFonts w:ascii="Consolas" w:hAnsi="Consolas"/>
-          <w:color w:val="16304E"/>
-          <w:sz w:val="16"/>
-        </w:rPr>
-        <w:t>Estudiante ajeno / GET       GET /grades/4/20 -&gt; 403 {'error': 'Acceso denegado'}</w:t>
-        <w:br/>
-      </w:r>
-      <w:r>
-        <w:rPr>
-          <w:rFonts w:ascii="Consolas" w:hAnsi="Consolas"/>
-          <w:color w:val="16304E"/>
-          <w:sz w:val="16"/>
-        </w:rPr>
-        <w:t>Estudiante propio / GET      GET /grades/3/10 -&gt; 200 {'grade': '90', 'group_id': 10, 'student_id': 3}</w:t>
-        <w:br/>
-      </w:r>
-      <w:r>
-        <w:rPr>
-          <w:rFonts w:ascii="Consolas" w:hAnsi="Consolas"/>
-          <w:color w:val="16304E"/>
-          <w:sz w:val="16"/>
-        </w:rPr>
-        <w:t>Estudiante propio / PUT      PUT /grades/3/10 -&gt; 403 {'error': 'Acceso denegado'}</w:t>
-        <w:br/>
-      </w:r>
-      <w:r>
-        <w:rPr>
-          <w:rFonts w:ascii="Consolas" w:hAnsi="Consolas"/>
-          <w:color w:val="16304E"/>
-          <w:sz w:val="16"/>
-        </w:rPr>
-        <w:t>Sin sesion / GET             GET /grades/3/10 -&gt; 401 {'error': 'Autenticación requerida'}</w:t>
-        <w:br/>
-      </w:r>
-      <w:r>
-        <w:rPr>
-          <w:rFonts w:ascii="Consolas" w:hAnsi="Consolas"/>
-          <w:color w:val="16304E"/>
-          <w:sz w:val="16"/>
-        </w:rPr>
-        <w:t>Sin CSRF / PUT               PUT /grades/3/10 -&gt; 403 {'error': 'CSRF inválido'}</w:t>
-        <w:br/>
-      </w:r>
-      <w:r>
-        <w:rPr>
-          <w:rFonts w:ascii="Consolas" w:hAnsi="Consolas"/>
-          <w:color w:val="16304E"/>
-          <w:sz w:val="16"/>
-        </w:rPr>
-        <w:t>Admin / PUT                  PUT /grades/3/10 -&gt; 403 {'error': 'Acceso denegado'}</w:t>
-        <w:br/>
-      </w:r>
-      <w:r>
-        <w:rPr>
-          <w:rFonts w:ascii="Consolas" w:hAnsi="Consolas"/>
-          <w:color w:val="16304E"/>
-          <w:sz w:val="16"/>
-        </w:rPr>
-        <w:t>Admin / GET                  GET /grades/3/10 -&gt; 403 {'error': 'Acceso denegado'}</w:t>
-        <w:br/>
-      </w:r>
-      <w:r>
-        <w:rPr>
-          <w:rFonts w:ascii="Consolas" w:hAnsi="Consolas"/>
-          <w:color w:val="16304E"/>
-          <w:sz w:val="16"/>
-        </w:rPr>
-        <w:t>Grupo cruzado alumno 4 en g10 PUT /grades/4/10 -&gt; 403 {'error': 'Acceso denegado'}</w:t>
+        <w:t>Captura 6. Casos manuales con el cliente de pruebas de Flask (scripts/casos_manuales.py).</w:t>
       </w:r>
     </w:p>
     <w:p>
@@ -3613,6 +3499,52 @@
     </w:p>
     <w:p>
       <w:r>
+        <w:drawing>
+          <wp:inline xmlns:a="http://schemas.openxmlformats.org/drawingml/2006/main" xmlns:pic="http://schemas.openxmlformats.org/drawingml/2006/picture">
+            <wp:extent cx="5760000" cy="972679"/>
+            <wp:docPr id="8" name="Picture 8"/>
+            <wp:cNvGraphicFramePr>
+              <a:graphicFrameLocks noChangeAspect="1"/>
+            </wp:cNvGraphicFramePr>
+            <a:graphic>
+              <a:graphicData uri="http://schemas.openxmlformats.org/drawingml/2006/picture">
+                <pic:pic>
+                  <pic:nvPicPr>
+                    <pic:cNvPr id="0" name="06_pip_audit.png"/>
+                    <pic:cNvPicPr/>
+                  </pic:nvPicPr>
+                  <pic:blipFill>
+                    <a:blip r:embed="rId22"/>
+                    <a:stretch>
+                      <a:fillRect/>
+                    </a:stretch>
+                  </pic:blipFill>
+                  <pic:spPr>
+                    <a:xfrm>
+                      <a:off x="0" y="0"/>
+                      <a:ext cx="5760000" cy="972679"/>
+                    </a:xfrm>
+                    <a:prstGeom prst="rect"/>
+                  </pic:spPr>
+                </pic:pic>
+              </a:graphicData>
+            </a:graphic>
+          </wp:inline>
+        </w:drawing>
+      </w:r>
+    </w:p>
+    <w:p>
+      <w:r>
+        <w:rPr>
+          <w:i/>
+          <w:color w:val="16304E"/>
+          <w:sz w:val="16"/>
+        </w:rPr>
+        <w:t>Captura 7. Versiones resueltas y auditoría de dependencias.</w:t>
+      </w:r>
+    </w:p>
+    <w:p>
+      <w:r>
         <w:rPr>
           <w:i w:val="0"/>
         </w:rPr>
@@ -3657,7 +3589,7 @@
         <w:rPr>
           <w:i w:val="0"/>
         </w:rPr>
-        <w:t>https://github.com/AlexMtzz244/proyDesSeguro/actions/runs/40815841813</w:t>
+        <w:t>https://github.com/AlexMtzz244/proyDesSeguro/actions/runs/40816110674</w:t>
       </w:r>
     </w:p>
     <w:tbl>
@@ -3794,7 +3726,7 @@
           </w:tcPr>
           <w:p>
             <w:r>
-              <w:t>15 passed in 6.65s</w:t>
+              <w:t>15 passed in 9.42s</w:t>
             </w:r>
           </w:p>
         </w:tc>
@@ -3832,6 +3764,52 @@
         </w:tc>
       </w:tr>
     </w:tbl>
+    <w:p>
+      <w:r>
+        <w:drawing>
+          <wp:inline xmlns:a="http://schemas.openxmlformats.org/drawingml/2006/main" xmlns:pic="http://schemas.openxmlformats.org/drawingml/2006/picture">
+            <wp:extent cx="5760000" cy="2450717"/>
+            <wp:docPr id="9" name="Picture 9"/>
+            <wp:cNvGraphicFramePr>
+              <a:graphicFrameLocks noChangeAspect="1"/>
+            </wp:cNvGraphicFramePr>
+            <a:graphic>
+              <a:graphicData uri="http://schemas.openxmlformats.org/drawingml/2006/picture">
+                <pic:pic>
+                  <pic:nvPicPr>
+                    <pic:cNvPr id="0" name="ci.png"/>
+                    <pic:cNvPicPr/>
+                  </pic:nvPicPr>
+                  <pic:blipFill>
+                    <a:blip r:embed="rId23"/>
+                    <a:stretch>
+                      <a:fillRect/>
+                    </a:stretch>
+                  </pic:blipFill>
+                  <pic:spPr>
+                    <a:xfrm>
+                      <a:off x="0" y="0"/>
+                      <a:ext cx="5760000" cy="2450717"/>
+                    </a:xfrm>
+                    <a:prstGeom prst="rect"/>
+                  </pic:spPr>
+                </pic:pic>
+              </a:graphicData>
+            </a:graphic>
+          </wp:inline>
+        </w:drawing>
+      </w:r>
+    </w:p>
+    <w:p>
+      <w:r>
+        <w:rPr>
+          <w:i/>
+          <w:color w:val="16304E"/>
+          <w:sz w:val="16"/>
+        </w:rPr>
+        <w:t>Captura 8. Ejecución del pipeline en el PR #1 (pasos y extracto del log del job, obtenidos de la API de GitHub Actions).</w:t>
+      </w:r>
+    </w:p>
     <w:p>
       <w:r>
         <w:rPr>

</xml_diff>